<commit_message>
cwiczenia 2026.04.13 rozwiązanie podzadanie 1.2
</commit_message>
<xml_diff>
--- a/lab_3/lab_3_zadanie_1.docx
+++ b/lab_3/lab_3_zadanie_1.docx
@@ -118,6 +118,508 @@
     <w:p>
       <w:pPr>
         <w:pStyle w:val="Akapitzlist"/>
+        <w:jc w:val="center"/>
+        <w:rPr>
+          <w:rFonts w:eastAsiaTheme="minorEastAsia"/>
+        </w:rPr>
+      </w:pPr>
+      <m:oMathPara>
+        <m:oMath>
+          <m:r>
+            <w:rPr>
+              <w:rFonts w:ascii="Cambria Math" w:hAnsi="Cambria Math"/>
+            </w:rPr>
+            <m:t>m</m:t>
+          </m:r>
+          <m:acc>
+            <m:accPr>
+              <m:chr m:val="̈"/>
+              <m:ctrlPr>
+                <w:rPr>
+                  <w:rFonts w:ascii="Cambria Math" w:hAnsi="Cambria Math"/>
+                  <w:i/>
+                </w:rPr>
+              </m:ctrlPr>
+            </m:accPr>
+            <m:e>
+              <m:r>
+                <w:rPr>
+                  <w:rFonts w:ascii="Cambria Math" w:hAnsi="Cambria Math"/>
+                </w:rPr>
+                <m:t>x</m:t>
+              </m:r>
+            </m:e>
+          </m:acc>
+          <m:r>
+            <w:rPr>
+              <w:rFonts w:ascii="Cambria Math" w:hAnsi="Cambria Math"/>
+            </w:rPr>
+            <m:t>= -kx-c</m:t>
+          </m:r>
+          <m:acc>
+            <m:accPr>
+              <m:chr m:val="̇"/>
+              <m:ctrlPr>
+                <w:rPr>
+                  <w:rFonts w:ascii="Cambria Math" w:hAnsi="Cambria Math"/>
+                  <w:i/>
+                </w:rPr>
+              </m:ctrlPr>
+            </m:accPr>
+            <m:e>
+              <m:r>
+                <w:rPr>
+                  <w:rFonts w:ascii="Cambria Math" w:hAnsi="Cambria Math"/>
+                </w:rPr>
+                <m:t>x</m:t>
+              </m:r>
+            </m:e>
+          </m:acc>
+        </m:oMath>
+      </m:oMathPara>
+    </w:p>
+    <w:p>
+      <w:pPr>
+        <w:pStyle w:val="Akapitzlist"/>
+        <w:jc w:val="center"/>
+      </w:pPr>
+      <m:oMathPara>
+        <m:oMath>
+          <m:acc>
+            <m:accPr>
+              <m:chr m:val="̈"/>
+              <m:ctrlPr>
+                <w:rPr>
+                  <w:rFonts w:ascii="Cambria Math" w:hAnsi="Cambria Math"/>
+                  <w:i/>
+                </w:rPr>
+              </m:ctrlPr>
+            </m:accPr>
+            <m:e>
+              <m:r>
+                <w:rPr>
+                  <w:rFonts w:ascii="Cambria Math" w:hAnsi="Cambria Math"/>
+                </w:rPr>
+                <m:t>x</m:t>
+              </m:r>
+            </m:e>
+          </m:acc>
+          <m:r>
+            <w:rPr>
+              <w:rFonts w:ascii="Cambria Math" w:hAnsi="Cambria Math"/>
+            </w:rPr>
+            <m:t>= -</m:t>
+          </m:r>
+          <m:f>
+            <m:fPr>
+              <m:ctrlPr>
+                <w:rPr>
+                  <w:rFonts w:ascii="Cambria Math" w:hAnsi="Cambria Math"/>
+                  <w:i/>
+                </w:rPr>
+              </m:ctrlPr>
+            </m:fPr>
+            <m:num>
+              <m:r>
+                <w:rPr>
+                  <w:rFonts w:ascii="Cambria Math" w:hAnsi="Cambria Math"/>
+                </w:rPr>
+                <m:t>k</m:t>
+              </m:r>
+            </m:num>
+            <m:den>
+              <m:r>
+                <w:rPr>
+                  <w:rFonts w:ascii="Cambria Math" w:hAnsi="Cambria Math"/>
+                </w:rPr>
+                <m:t>m</m:t>
+              </m:r>
+            </m:den>
+          </m:f>
+          <m:r>
+            <w:rPr>
+              <w:rFonts w:ascii="Cambria Math" w:hAnsi="Cambria Math"/>
+            </w:rPr>
+            <m:t>x-</m:t>
+          </m:r>
+          <m:f>
+            <m:fPr>
+              <m:ctrlPr>
+                <w:rPr>
+                  <w:rFonts w:ascii="Cambria Math" w:hAnsi="Cambria Math"/>
+                  <w:i/>
+                </w:rPr>
+              </m:ctrlPr>
+            </m:fPr>
+            <m:num>
+              <m:r>
+                <w:rPr>
+                  <w:rFonts w:ascii="Cambria Math" w:hAnsi="Cambria Math"/>
+                </w:rPr>
+                <m:t>c</m:t>
+              </m:r>
+            </m:num>
+            <m:den>
+              <m:r>
+                <w:rPr>
+                  <w:rFonts w:ascii="Cambria Math" w:hAnsi="Cambria Math"/>
+                </w:rPr>
+                <m:t>m</m:t>
+              </m:r>
+            </m:den>
+          </m:f>
+          <m:acc>
+            <m:accPr>
+              <m:chr m:val="̇"/>
+              <m:ctrlPr>
+                <w:rPr>
+                  <w:rFonts w:ascii="Cambria Math" w:hAnsi="Cambria Math"/>
+                  <w:i/>
+                </w:rPr>
+              </m:ctrlPr>
+            </m:accPr>
+            <m:e>
+              <m:r>
+                <w:rPr>
+                  <w:rFonts w:ascii="Cambria Math" w:hAnsi="Cambria Math"/>
+                </w:rPr>
+                <m:t>x</m:t>
+              </m:r>
+            </m:e>
+          </m:acc>
+        </m:oMath>
+      </m:oMathPara>
+    </w:p>
+    <w:p>
+      <w:pPr>
+        <w:pStyle w:val="Akapitzlist"/>
+        <w:jc w:val="center"/>
+      </w:pPr>
+      <m:oMath>
+        <m:acc>
+          <m:accPr>
+            <m:chr m:val="̅"/>
+            <m:ctrlPr>
+              <w:rPr>
+                <w:rFonts w:ascii="Cambria Math" w:hAnsi="Cambria Math"/>
+                <w:b/>
+                <w:i/>
+              </w:rPr>
+            </m:ctrlPr>
+          </m:accPr>
+          <m:e>
+            <m:r>
+              <m:rPr>
+                <m:sty m:val="bi"/>
+              </m:rPr>
+              <w:rPr>
+                <w:rFonts w:ascii="Cambria Math" w:hAnsi="Cambria Math"/>
+              </w:rPr>
+              <m:t>x</m:t>
+            </m:r>
+          </m:e>
+        </m:acc>
+        <m:r>
+          <w:rPr>
+            <w:rFonts w:ascii="Cambria Math" w:hAnsi="Cambria Math"/>
+          </w:rPr>
+          <m:t>=</m:t>
+        </m:r>
+        <m:d>
+          <m:dPr>
+            <m:ctrlPr>
+              <w:rPr>
+                <w:rFonts w:ascii="Cambria Math" w:hAnsi="Cambria Math"/>
+                <w:i/>
+              </w:rPr>
+            </m:ctrlPr>
+          </m:dPr>
+          <m:e>
+            <m:m>
+              <m:mPr>
+                <m:mcs>
+                  <m:mc>
+                    <m:mcPr>
+                      <m:count m:val="1"/>
+                      <m:mcJc m:val="center"/>
+                    </m:mcPr>
+                  </m:mc>
+                </m:mcs>
+                <m:ctrlPr>
+                  <w:rPr>
+                    <w:rFonts w:ascii="Cambria Math" w:hAnsi="Cambria Math"/>
+                    <w:i/>
+                  </w:rPr>
+                </m:ctrlPr>
+              </m:mPr>
+              <m:mr>
+                <m:e>
+                  <m:acc>
+                    <m:accPr>
+                      <m:chr m:val="̇"/>
+                      <m:ctrlPr>
+                        <w:rPr>
+                          <w:rFonts w:ascii="Cambria Math" w:hAnsi="Cambria Math"/>
+                          <w:i/>
+                        </w:rPr>
+                      </m:ctrlPr>
+                    </m:accPr>
+                    <m:e>
+                      <m:r>
+                        <w:rPr>
+                          <w:rFonts w:ascii="Cambria Math" w:hAnsi="Cambria Math"/>
+                        </w:rPr>
+                        <m:t>x</m:t>
+                      </m:r>
+                    </m:e>
+                  </m:acc>
+                </m:e>
+              </m:mr>
+              <m:mr>
+                <m:e>
+                  <m:r>
+                    <w:rPr>
+                      <w:rFonts w:ascii="Cambria Math" w:hAnsi="Cambria Math"/>
+                    </w:rPr>
+                    <m:t>x</m:t>
+                  </m:r>
+                </m:e>
+              </m:mr>
+            </m:m>
+          </m:e>
+        </m:d>
+      </m:oMath>
+      <w:r>
+        <w:rPr>
+          <w:rFonts w:eastAsiaTheme="minorEastAsia"/>
+        </w:rPr>
+        <w:t xml:space="preserve">       </w:t>
+      </w:r>
+      <m:oMath>
+        <m:f>
+          <m:fPr>
+            <m:ctrlPr>
+              <w:rPr>
+                <w:rFonts w:ascii="Cambria Math" w:eastAsiaTheme="minorEastAsia" w:hAnsi="Cambria Math"/>
+                <w:i/>
+              </w:rPr>
+            </m:ctrlPr>
+          </m:fPr>
+          <m:num>
+            <m:r>
+              <w:rPr>
+                <w:rFonts w:ascii="Cambria Math" w:eastAsiaTheme="minorEastAsia" w:hAnsi="Cambria Math"/>
+              </w:rPr>
+              <m:t>d</m:t>
+            </m:r>
+            <m:acc>
+              <m:accPr>
+                <m:chr m:val="̅"/>
+                <m:ctrlPr>
+                  <w:rPr>
+                    <w:rFonts w:ascii="Cambria Math" w:eastAsiaTheme="minorEastAsia" w:hAnsi="Cambria Math"/>
+                    <w:b/>
+                    <w:i/>
+                  </w:rPr>
+                </m:ctrlPr>
+              </m:accPr>
+              <m:e>
+                <m:r>
+                  <m:rPr>
+                    <m:sty m:val="bi"/>
+                  </m:rPr>
+                  <w:rPr>
+                    <w:rFonts w:ascii="Cambria Math" w:eastAsiaTheme="minorEastAsia" w:hAnsi="Cambria Math"/>
+                  </w:rPr>
+                  <m:t>x</m:t>
+                </m:r>
+              </m:e>
+            </m:acc>
+          </m:num>
+          <m:den>
+            <m:r>
+              <w:rPr>
+                <w:rFonts w:ascii="Cambria Math" w:eastAsiaTheme="minorEastAsia" w:hAnsi="Cambria Math"/>
+              </w:rPr>
+              <m:t>dt</m:t>
+            </m:r>
+          </m:den>
+        </m:f>
+        <m:r>
+          <w:rPr>
+            <w:rFonts w:ascii="Cambria Math" w:eastAsiaTheme="minorEastAsia" w:hAnsi="Cambria Math"/>
+          </w:rPr>
+          <m:t>=A</m:t>
+        </m:r>
+        <m:acc>
+          <m:accPr>
+            <m:chr m:val="̅"/>
+            <m:ctrlPr>
+              <w:rPr>
+                <w:rFonts w:ascii="Cambria Math" w:eastAsiaTheme="minorEastAsia" w:hAnsi="Cambria Math"/>
+                <w:b/>
+                <w:i/>
+              </w:rPr>
+            </m:ctrlPr>
+          </m:accPr>
+          <m:e>
+            <m:r>
+              <m:rPr>
+                <m:sty m:val="bi"/>
+              </m:rPr>
+              <w:rPr>
+                <w:rFonts w:ascii="Cambria Math" w:eastAsiaTheme="minorEastAsia" w:hAnsi="Cambria Math"/>
+              </w:rPr>
+              <m:t>x</m:t>
+            </m:r>
+          </m:e>
+        </m:acc>
+      </m:oMath>
+      <w:r>
+        <w:rPr>
+          <w:rFonts w:eastAsiaTheme="minorEastAsia"/>
+          <w:b/>
+        </w:rPr>
+        <w:t xml:space="preserve">          </w:t>
+      </w:r>
+      <m:oMath>
+        <m:r>
+          <w:rPr>
+            <w:rFonts w:ascii="Cambria Math" w:eastAsiaTheme="minorEastAsia" w:hAnsi="Cambria Math"/>
+          </w:rPr>
+          <m:t>A=</m:t>
+        </m:r>
+        <m:d>
+          <m:dPr>
+            <m:ctrlPr>
+              <w:rPr>
+                <w:rFonts w:ascii="Cambria Math" w:eastAsiaTheme="minorEastAsia" w:hAnsi="Cambria Math"/>
+                <w:i/>
+              </w:rPr>
+            </m:ctrlPr>
+          </m:dPr>
+          <m:e>
+            <m:m>
+              <m:mPr>
+                <m:mcs>
+                  <m:mc>
+                    <m:mcPr>
+                      <m:count m:val="2"/>
+                      <m:mcJc m:val="center"/>
+                    </m:mcPr>
+                  </m:mc>
+                </m:mcs>
+                <m:ctrlPr>
+                  <w:rPr>
+                    <w:rFonts w:ascii="Cambria Math" w:eastAsiaTheme="minorEastAsia" w:hAnsi="Cambria Math"/>
+                    <w:i/>
+                  </w:rPr>
+                </m:ctrlPr>
+              </m:mPr>
+              <m:mr>
+                <m:e>
+                  <m:r>
+                    <w:rPr>
+                      <w:rFonts w:ascii="Cambria Math" w:eastAsiaTheme="minorEastAsia" w:hAnsi="Cambria Math"/>
+                    </w:rPr>
+                    <m:t>-</m:t>
+                  </m:r>
+                  <m:f>
+                    <m:fPr>
+                      <m:ctrlPr>
+                        <w:rPr>
+                          <w:rFonts w:ascii="Cambria Math" w:eastAsiaTheme="minorEastAsia" w:hAnsi="Cambria Math"/>
+                          <w:i/>
+                        </w:rPr>
+                      </m:ctrlPr>
+                    </m:fPr>
+                    <m:num>
+                      <m:r>
+                        <w:rPr>
+                          <w:rFonts w:ascii="Cambria Math" w:eastAsiaTheme="minorEastAsia" w:hAnsi="Cambria Math"/>
+                        </w:rPr>
+                        <m:t>c</m:t>
+                      </m:r>
+                    </m:num>
+                    <m:den>
+                      <m:r>
+                        <w:rPr>
+                          <w:rFonts w:ascii="Cambria Math" w:eastAsiaTheme="minorEastAsia" w:hAnsi="Cambria Math"/>
+                        </w:rPr>
+                        <m:t>m</m:t>
+                      </m:r>
+                    </m:den>
+                  </m:f>
+                </m:e>
+                <m:e>
+                  <m:r>
+                    <w:rPr>
+                      <w:rFonts w:ascii="Cambria Math" w:eastAsiaTheme="minorEastAsia" w:hAnsi="Cambria Math"/>
+                    </w:rPr>
+                    <m:t>-</m:t>
+                  </m:r>
+                  <m:f>
+                    <m:fPr>
+                      <m:ctrlPr>
+                        <w:rPr>
+                          <w:rFonts w:ascii="Cambria Math" w:eastAsiaTheme="minorEastAsia" w:hAnsi="Cambria Math"/>
+                          <w:i/>
+                        </w:rPr>
+                      </m:ctrlPr>
+                    </m:fPr>
+                    <m:num>
+                      <m:r>
+                        <w:rPr>
+                          <w:rFonts w:ascii="Cambria Math" w:eastAsiaTheme="minorEastAsia" w:hAnsi="Cambria Math"/>
+                        </w:rPr>
+                        <m:t>k</m:t>
+                      </m:r>
+                    </m:num>
+                    <m:den>
+                      <m:r>
+                        <w:rPr>
+                          <w:rFonts w:ascii="Cambria Math" w:eastAsiaTheme="minorEastAsia" w:hAnsi="Cambria Math"/>
+                        </w:rPr>
+                        <m:t>m</m:t>
+                      </m:r>
+                    </m:den>
+                  </m:f>
+                </m:e>
+              </m:mr>
+              <m:mr>
+                <m:e>
+                  <m:r>
+                    <w:rPr>
+                      <w:rFonts w:ascii="Cambria Math" w:eastAsiaTheme="minorEastAsia" w:hAnsi="Cambria Math"/>
+                    </w:rPr>
+                    <m:t>1</m:t>
+                  </m:r>
+                </m:e>
+                <m:e>
+                  <m:r>
+                    <w:rPr>
+                      <w:rFonts w:ascii="Cambria Math" w:eastAsiaTheme="minorEastAsia" w:hAnsi="Cambria Math"/>
+                    </w:rPr>
+                    <m:t>0</m:t>
+                  </m:r>
+                </m:e>
+              </m:mr>
+            </m:m>
+          </m:e>
+        </m:d>
+      </m:oMath>
+    </w:p>
+    <w:p>
+      <w:pPr>
+        <w:pStyle w:val="Akapitzlist"/>
+        <w:jc w:val="center"/>
+      </w:pPr>
+      <w:bookmarkStart w:id="0" w:name="_GoBack"/>
+      <w:bookmarkEnd w:id="0"/>
+    </w:p>
+    <w:p>
+      <w:pPr>
+        <w:pStyle w:val="Akapitzlist"/>
         <w:jc w:val="both"/>
       </w:pPr>
       <w:r>
@@ -127,19 +629,7 @@
         <w:t xml:space="preserve">parametry: </w:t>
       </w:r>
       <w:r>
-        <w:t>m</w:t>
-      </w:r>
-      <w:r>
-        <w:t>asa m = 1 kg</w:t>
-      </w:r>
-      <w:r>
-        <w:t>, s</w:t>
-      </w:r>
-      <w:r>
-        <w:t>ztywność k = 4 N/m</w:t>
-      </w:r>
-      <w:r>
-        <w:t>. Zbadaj rozwiązania dla:</w:t>
+        <w:t>masa m = 1 kg, sztywność k = 4 N/m. Zbadaj rozwiązania dla:</w:t>
       </w:r>
     </w:p>
     <w:p>
@@ -152,13 +642,7 @@
         <w:jc w:val="both"/>
       </w:pPr>
       <w:r>
-        <w:t>c = 0: Brak tłumienia (</w:t>
-      </w:r>
-      <w:r>
-        <w:t>układ nietłumiony</w:t>
-      </w:r>
-      <w:r>
-        <w:t>).</w:t>
+        <w:t>c = 0: Brak tłumienia (układ nietłumiony).</w:t>
       </w:r>
     </w:p>
     <w:p>
@@ -171,13 +655,7 @@
         <w:jc w:val="both"/>
       </w:pPr>
       <w:r>
-        <w:t>c = 0.5: Tłumienie podkrytyczne (</w:t>
-      </w:r>
-      <w:r>
-        <w:t>oscylator harmoniczny tłumiony</w:t>
-      </w:r>
-      <w:r>
-        <w:t>).</w:t>
+        <w:t>c = 0.5: Tłumienie podkrytyczne (oscylator harmoniczny tłumiony).</w:t>
       </w:r>
     </w:p>
     <w:p>
@@ -190,13 +668,7 @@
         <w:jc w:val="both"/>
       </w:pPr>
       <w:r>
-        <w:t xml:space="preserve">c = 4: Tłumienie krytyczne (najszybszy powrót </w:t>
-      </w:r>
-      <w:r>
-        <w:t xml:space="preserve">do stanu równowagi </w:t>
-      </w:r>
-      <w:r>
-        <w:t>bez oscylacji).</w:t>
+        <w:t>c = 4: Tłumienie krytyczne (najszybszy powrót do stanu równowagi bez oscylacji).</w:t>
       </w:r>
     </w:p>
     <w:p>
@@ -209,13 +681,7 @@
         <w:jc w:val="both"/>
       </w:pPr>
       <w:r>
-        <w:t xml:space="preserve">c = 6: Tłumienie nadkrytyczne (powolny powrót </w:t>
-      </w:r>
-      <w:r>
-        <w:t xml:space="preserve">do stanu równowagi </w:t>
-      </w:r>
-      <w:r>
-        <w:t>bez oscylacji).</w:t>
+        <w:t>c = 6: Tłumienie nadkrytyczne (powolny powrót do stanu równowagi bez oscylacji).</w:t>
       </w:r>
     </w:p>
     <w:p>
@@ -228,10 +694,7 @@
         <w:jc w:val="both"/>
       </w:pPr>
       <w:r>
-        <w:t xml:space="preserve">c = -0.5: </w:t>
-      </w:r>
-      <w:r>
-        <w:t>Układ niestabilny (</w:t>
+        <w:t>c = -0.5: Układ niestabilny (</w:t>
       </w:r>
       <w:proofErr w:type="spellStart"/>
       <w:r>
@@ -239,10 +702,7 @@
       </w:r>
       <w:proofErr w:type="spellEnd"/>
       <w:r>
-        <w:t xml:space="preserve"> wartość tłumienia)</w:t>
-      </w:r>
-      <w:r>
-        <w:t>.</w:t>
+        <w:t xml:space="preserve"> wartość tłumienia).</w:t>
       </w:r>
     </w:p>
     <w:p>
@@ -597,16 +1057,7 @@
                       <w:kern w:val="24"/>
                       <w:szCs w:val="40"/>
                     </w:rPr>
-                    <m:t>A(t-</m:t>
-                  </m:r>
-                  <m:r>
-                    <w:rPr>
-                      <w:rFonts w:ascii="Cambria Math" w:hAnsi="Cambria Math" w:cstheme="minorBidi"/>
-                      <w:color w:val="000000" w:themeColor="text1"/>
-                      <w:kern w:val="24"/>
-                      <w:szCs w:val="40"/>
-                    </w:rPr>
-                    <m:t>τ</m:t>
+                    <m:t>A(t-τ</m:t>
                   </m:r>
                 </m:e>
               </m:d>
@@ -617,16 +1068,7 @@
                   <w:kern w:val="24"/>
                   <w:szCs w:val="40"/>
                 </w:rPr>
-                <m:t>)</m:t>
-              </m:r>
-              <m:r>
-                <w:rPr>
-                  <w:rFonts w:ascii="Cambria Math" w:hAnsi="Cambria Math" w:cstheme="minorBidi"/>
-                  <w:color w:val="000000" w:themeColor="text1"/>
-                  <w:kern w:val="24"/>
-                  <w:szCs w:val="40"/>
-                </w:rPr>
-                <m:t>B</m:t>
+                <m:t>)B</m:t>
               </m:r>
               <m:r>
                 <m:rPr>
@@ -1095,13 +1537,7 @@
         <w:rPr>
           <w:rFonts w:ascii="Courier New" w:hAnsi="Courier New" w:cs="Courier New"/>
         </w:rPr>
-        <w:t>s</w:t>
-      </w:r>
-      <w:r>
-        <w:rPr>
-          <w:rFonts w:ascii="Courier New" w:hAnsi="Courier New" w:cs="Courier New"/>
-        </w:rPr>
-        <w:t>olve_linear_control_system</w:t>
+        <w:t>solve_linear_control_system</w:t>
       </w:r>
       <w:proofErr w:type="spellEnd"/>
       <w:r>
@@ -1306,13 +1742,8 @@
         <w:rPr>
           <w:rFonts w:cstheme="minorHAnsi"/>
         </w:rPr>
-        <w:t>Wykorzystując napisaną metodę wyznacz charakterystykę częstotliwościową filtra</w:t>
-      </w:r>
-      <w:r>
-        <w:rPr>
-          <w:rFonts w:cstheme="minorHAnsi"/>
-        </w:rPr>
-        <w:t xml:space="preserve"> pasmowego RLC</w:t>
+        <w:lastRenderedPageBreak/>
+        <w:t>Wykorzystując napisaną metodę wyznacz charakterystykę częstotliwościową filtra pasmowego RLC</w:t>
       </w:r>
     </w:p>
     <w:p>
@@ -1324,7 +1755,9 @@
         </w:rPr>
       </w:pPr>
       <w:r>
-        <w:lastRenderedPageBreak/>
+        <w:rPr>
+          <w:noProof/>
+        </w:rPr>
         <w:drawing>
           <wp:inline distT="0" distB="0" distL="0" distR="0" wp14:anchorId="369ECB6C" wp14:editId="54E37094">
             <wp:extent cx="2331922" cy="3200677"/>
@@ -1395,6 +1828,7 @@
       <w:r>
         <w:rPr>
           <w:rFonts w:cstheme="minorHAnsi"/>
+          <w:noProof/>
         </w:rPr>
         <w:drawing>
           <wp:inline distT="0" distB="0" distL="0" distR="0" wp14:anchorId="1B9CFF0A" wp14:editId="619ACA1E">
@@ -1443,6 +1877,9 @@
         <w:jc w:val="center"/>
       </w:pPr>
       <w:r>
+        <w:rPr>
+          <w:noProof/>
+        </w:rPr>
         <w:drawing>
           <wp:inline distT="0" distB="0" distL="0" distR="0" wp14:anchorId="599EA352" wp14:editId="46A5AC70">
             <wp:extent cx="2991109" cy="552498"/>
@@ -1491,10 +1928,7 @@
         <w:t xml:space="preserve">a sygnał na wyjściu przyjmij napięcie na oporniku R. </w:t>
       </w:r>
     </w:p>
-    <w:p>
-      <w:bookmarkStart w:id="0" w:name="_GoBack"/>
-      <w:bookmarkEnd w:id="0"/>
-    </w:p>
+    <w:p/>
     <w:sectPr>
       <w:pgSz w:w="11906" w:h="16838"/>
       <w:pgMar w:top="1417" w:right="1417" w:bottom="1417" w:left="1417" w:header="708" w:footer="708" w:gutter="0"/>
@@ -2211,6 +2645,7 @@
   <w:style w:type="character" w:default="1" w:styleId="Domylnaczcionkaakapitu">
     <w:name w:val="Default Paragraph Font"/>
     <w:uiPriority w:val="1"/>
+    <w:semiHidden/>
     <w:unhideWhenUsed/>
   </w:style>
   <w:style w:type="table" w:default="1" w:styleId="Standardowy">

</xml_diff>

<commit_message>
rozwiazanie zadania ppkt_3a i dodatkowy material do poczytania
</commit_message>
<xml_diff>
--- a/lab_3/lab_3_zadanie_1.docx
+++ b/lab_3/lab_3_zadanie_1.docx
@@ -614,8 +614,6 @@
         <w:pStyle w:val="Akapitzlist"/>
         <w:jc w:val="center"/>
       </w:pPr>
-      <w:bookmarkStart w:id="0" w:name="_GoBack"/>
-      <w:bookmarkEnd w:id="0"/>
     </w:p>
     <w:p>
       <w:pPr>
@@ -1120,6 +1118,75 @@
           </m:nary>
         </m:oMath>
       </m:oMathPara>
+    </w:p>
+    <w:p>
+      <w:pPr>
+        <w:pStyle w:val="NormalnyWeb"/>
+        <w:spacing w:before="0" w:beforeAutospacing="0" w:after="0" w:afterAutospacing="0"/>
+        <w:jc w:val="both"/>
+        <w:rPr>
+          <w:iCs/>
+          <w:color w:val="000000" w:themeColor="text1"/>
+          <w:kern w:val="24"/>
+          <w:szCs w:val="40"/>
+        </w:rPr>
+      </w:pPr>
+      <w:r>
+        <w:rPr>
+          <w:iCs/>
+          <w:color w:val="000000" w:themeColor="text1"/>
+          <w:kern w:val="24"/>
+          <w:szCs w:val="40"/>
+        </w:rPr>
+        <w:t>(</w:t>
+      </w:r>
+      <w:r>
+        <w:rPr>
+          <w:iCs/>
+          <w:color w:val="FF0000"/>
+          <w:kern w:val="24"/>
+          <w:szCs w:val="40"/>
+        </w:rPr>
+        <w:t xml:space="preserve">zadanie domowe – </w:t>
+      </w:r>
+      <w:proofErr w:type="spellStart"/>
+      <w:r>
+        <w:rPr>
+          <w:iCs/>
+          <w:color w:val="FF0000"/>
+          <w:kern w:val="24"/>
+          <w:szCs w:val="40"/>
+        </w:rPr>
+        <w:t>sprawdz</w:t>
+      </w:r>
+      <w:proofErr w:type="spellEnd"/>
+      <w:r>
+        <w:rPr>
+          <w:iCs/>
+          <w:color w:val="FF0000"/>
+          <w:kern w:val="24"/>
+          <w:szCs w:val="40"/>
+        </w:rPr>
+        <w:t xml:space="preserve"> ten wzór</w:t>
+      </w:r>
+      <w:r>
+        <w:rPr>
+          <w:iCs/>
+          <w:color w:val="FF0000"/>
+          <w:kern w:val="24"/>
+          <w:szCs w:val="40"/>
+        </w:rPr>
+        <w:t xml:space="preserve"> na dole</w:t>
+      </w:r>
+      <w:r>
+        <w:rPr>
+          <w:iCs/>
+          <w:color w:val="000000" w:themeColor="text1"/>
+          <w:kern w:val="24"/>
+          <w:szCs w:val="40"/>
+        </w:rPr>
+        <w:t>)</w:t>
+      </w:r>
     </w:p>
     <w:p>
       <w:pPr>
@@ -1709,6 +1776,1003 @@
     </w:p>
     <w:p>
       <w:pPr>
+        <w:jc w:val="both"/>
+        <w:rPr>
+          <w:rFonts w:cstheme="minorHAnsi"/>
+        </w:rPr>
+      </w:pPr>
+    </w:p>
+    <w:p>
+      <w:pPr>
+        <w:jc w:val="both"/>
+        <w:rPr>
+          <w:rFonts w:cstheme="minorHAnsi"/>
+        </w:rPr>
+      </w:pPr>
+      <w:r>
+        <w:rPr>
+          <w:rFonts w:cstheme="minorHAnsi"/>
+        </w:rPr>
+        <w:lastRenderedPageBreak/>
+        <w:t>3a. Przetestuj działanie metody dla masy swobodnej z działaniem stałej siły.</w:t>
+      </w:r>
+    </w:p>
+    <w:p>
+      <w:pPr>
+        <w:pStyle w:val="NormalnyWeb"/>
+        <w:spacing w:before="0" w:beforeAutospacing="0" w:after="0" w:afterAutospacing="0"/>
+        <w:jc w:val="both"/>
+        <w:rPr>
+          <w:iCs/>
+          <w:color w:val="000000" w:themeColor="text1"/>
+          <w:kern w:val="24"/>
+          <w:szCs w:val="40"/>
+        </w:rPr>
+      </w:pPr>
+      <m:oMathPara>
+        <m:oMath>
+          <m:r>
+            <m:rPr>
+              <m:sty m:val="b"/>
+            </m:rPr>
+            <w:rPr>
+              <w:rFonts w:ascii="Cambria Math" w:hAnsi="Cambria Math" w:cstheme="minorBidi"/>
+              <w:color w:val="000000" w:themeColor="text1"/>
+              <w:kern w:val="24"/>
+              <w:szCs w:val="40"/>
+            </w:rPr>
+            <m:t>x</m:t>
+          </m:r>
+          <m:d>
+            <m:dPr>
+              <m:ctrlPr>
+                <w:rPr>
+                  <w:rFonts w:ascii="Cambria Math" w:hAnsi="Cambria Math" w:cstheme="minorBidi"/>
+                  <w:b/>
+                  <w:bCs/>
+                  <w:i/>
+                  <w:iCs/>
+                  <w:color w:val="000000" w:themeColor="text1"/>
+                  <w:kern w:val="24"/>
+                  <w:szCs w:val="40"/>
+                </w:rPr>
+              </m:ctrlPr>
+            </m:dPr>
+            <m:e>
+              <m:r>
+                <m:rPr>
+                  <m:sty m:val="p"/>
+                </m:rPr>
+                <w:rPr>
+                  <w:rFonts w:ascii="Cambria Math" w:hAnsi="Cambria Math" w:cstheme="minorBidi"/>
+                  <w:color w:val="000000" w:themeColor="text1"/>
+                  <w:kern w:val="24"/>
+                  <w:szCs w:val="40"/>
+                </w:rPr>
+                <m:t>t</m:t>
+              </m:r>
+            </m:e>
+          </m:d>
+          <m:r>
+            <m:rPr>
+              <m:sty m:val="b"/>
+            </m:rPr>
+            <w:rPr>
+              <w:rFonts w:ascii="Cambria Math" w:hAnsi="Cambria Math" w:cstheme="minorBidi"/>
+              <w:color w:val="000000" w:themeColor="text1"/>
+              <w:kern w:val="24"/>
+              <w:szCs w:val="40"/>
+            </w:rPr>
+            <m:t>=</m:t>
+          </m:r>
+          <m:r>
+            <m:rPr>
+              <m:sty m:val="p"/>
+            </m:rPr>
+            <w:rPr>
+              <w:rFonts w:ascii="Cambria Math" w:hAnsi="Cambria Math" w:cstheme="minorBidi"/>
+              <w:color w:val="000000" w:themeColor="text1"/>
+              <w:kern w:val="24"/>
+              <w:szCs w:val="40"/>
+            </w:rPr>
+            <m:t>exp</m:t>
+          </m:r>
+          <m:d>
+            <m:dPr>
+              <m:ctrlPr>
+                <w:rPr>
+                  <w:rFonts w:ascii="Cambria Math" w:hAnsi="Cambria Math" w:cstheme="minorBidi"/>
+                  <w:i/>
+                  <w:iCs/>
+                  <w:color w:val="000000" w:themeColor="text1"/>
+                  <w:kern w:val="24"/>
+                  <w:szCs w:val="40"/>
+                </w:rPr>
+              </m:ctrlPr>
+            </m:dPr>
+            <m:e>
+              <m:r>
+                <w:rPr>
+                  <w:rFonts w:ascii="Cambria Math" w:hAnsi="Cambria Math" w:cstheme="minorBidi"/>
+                  <w:color w:val="000000" w:themeColor="text1"/>
+                  <w:kern w:val="24"/>
+                  <w:szCs w:val="40"/>
+                </w:rPr>
+                <m:t>A</m:t>
+              </m:r>
+              <m:r>
+                <m:rPr>
+                  <m:sty m:val="p"/>
+                </m:rPr>
+                <w:rPr>
+                  <w:rFonts w:ascii="Cambria Math" w:hAnsi="Cambria Math" w:cstheme="minorBidi"/>
+                  <w:color w:val="000000" w:themeColor="text1"/>
+                  <w:kern w:val="24"/>
+                  <w:szCs w:val="40"/>
+                </w:rPr>
+                <m:t>t</m:t>
+              </m:r>
+            </m:e>
+          </m:d>
+          <m:sSub>
+            <m:sSubPr>
+              <m:ctrlPr>
+                <w:rPr>
+                  <w:rFonts w:ascii="Cambria Math" w:hAnsi="Cambria Math" w:cstheme="minorBidi"/>
+                  <w:i/>
+                  <w:iCs/>
+                  <w:color w:val="000000" w:themeColor="text1"/>
+                  <w:kern w:val="24"/>
+                  <w:szCs w:val="40"/>
+                </w:rPr>
+              </m:ctrlPr>
+            </m:sSubPr>
+            <m:e>
+              <m:r>
+                <m:rPr>
+                  <m:sty m:val="b"/>
+                </m:rPr>
+                <w:rPr>
+                  <w:rFonts w:ascii="Cambria Math" w:hAnsi="Cambria Math" w:cstheme="minorBidi"/>
+                  <w:color w:val="000000" w:themeColor="text1"/>
+                  <w:kern w:val="24"/>
+                  <w:szCs w:val="40"/>
+                </w:rPr>
+                <m:t>x</m:t>
+              </m:r>
+            </m:e>
+            <m:sub>
+              <m:r>
+                <w:rPr>
+                  <w:rFonts w:ascii="Cambria Math" w:hAnsi="Cambria Math" w:cstheme="minorBidi"/>
+                  <w:color w:val="000000" w:themeColor="text1"/>
+                  <w:kern w:val="24"/>
+                  <w:szCs w:val="40"/>
+                </w:rPr>
+                <m:t>0</m:t>
+              </m:r>
+            </m:sub>
+          </m:sSub>
+          <m:r>
+            <w:rPr>
+              <w:rFonts w:ascii="Cambria Math" w:hAnsi="Cambria Math" w:cstheme="minorBidi"/>
+              <w:color w:val="000000" w:themeColor="text1"/>
+              <w:kern w:val="24"/>
+              <w:szCs w:val="40"/>
+            </w:rPr>
+            <m:t>+</m:t>
+          </m:r>
+          <m:nary>
+            <m:naryPr>
+              <m:ctrlPr>
+                <w:rPr>
+                  <w:rFonts w:ascii="Cambria Math" w:hAnsi="Cambria Math" w:cstheme="minorBidi"/>
+                  <w:i/>
+                  <w:iCs/>
+                  <w:color w:val="000000" w:themeColor="text1"/>
+                  <w:kern w:val="24"/>
+                  <w:szCs w:val="40"/>
+                </w:rPr>
+              </m:ctrlPr>
+            </m:naryPr>
+            <m:sub>
+              <m:r>
+                <w:rPr>
+                  <w:rFonts w:ascii="Cambria Math" w:hAnsi="Cambria Math" w:cstheme="minorBidi"/>
+                  <w:color w:val="000000" w:themeColor="text1"/>
+                  <w:kern w:val="24"/>
+                  <w:szCs w:val="40"/>
+                </w:rPr>
+                <m:t>0</m:t>
+              </m:r>
+            </m:sub>
+            <m:sup>
+              <m:r>
+                <w:rPr>
+                  <w:rFonts w:ascii="Cambria Math" w:hAnsi="Cambria Math" w:cstheme="minorBidi"/>
+                  <w:color w:val="000000" w:themeColor="text1"/>
+                  <w:kern w:val="24"/>
+                  <w:szCs w:val="40"/>
+                </w:rPr>
+                <m:t>t</m:t>
+              </m:r>
+            </m:sup>
+            <m:e>
+              <m:r>
+                <m:rPr>
+                  <m:sty m:val="p"/>
+                </m:rPr>
+                <w:rPr>
+                  <w:rFonts w:ascii="Cambria Math" w:hAnsi="Cambria Math" w:cstheme="minorBidi"/>
+                  <w:color w:val="000000" w:themeColor="text1"/>
+                  <w:kern w:val="24"/>
+                  <w:szCs w:val="40"/>
+                </w:rPr>
+                <m:t>exp</m:t>
+              </m:r>
+              <m:d>
+                <m:dPr>
+                  <m:ctrlPr>
+                    <w:rPr>
+                      <w:rFonts w:ascii="Cambria Math" w:hAnsi="Cambria Math" w:cstheme="minorBidi"/>
+                      <w:i/>
+                      <w:iCs/>
+                      <w:color w:val="000000" w:themeColor="text1"/>
+                      <w:kern w:val="24"/>
+                      <w:szCs w:val="40"/>
+                    </w:rPr>
+                  </m:ctrlPr>
+                </m:dPr>
+                <m:e>
+                  <m:r>
+                    <w:rPr>
+                      <w:rFonts w:ascii="Cambria Math" w:hAnsi="Cambria Math" w:cstheme="minorBidi"/>
+                      <w:color w:val="000000" w:themeColor="text1"/>
+                      <w:kern w:val="24"/>
+                      <w:szCs w:val="40"/>
+                    </w:rPr>
+                    <m:t>A(t-τ</m:t>
+                  </m:r>
+                </m:e>
+              </m:d>
+              <m:r>
+                <w:rPr>
+                  <w:rFonts w:ascii="Cambria Math" w:hAnsi="Cambria Math" w:cstheme="minorBidi"/>
+                  <w:color w:val="000000" w:themeColor="text1"/>
+                  <w:kern w:val="24"/>
+                  <w:szCs w:val="40"/>
+                </w:rPr>
+                <m:t>)B</m:t>
+              </m:r>
+              <m:r>
+                <m:rPr>
+                  <m:sty m:val="bi"/>
+                </m:rPr>
+                <w:rPr>
+                  <w:rFonts w:ascii="Cambria Math" w:hAnsi="Cambria Math" w:cstheme="minorBidi"/>
+                  <w:color w:val="000000" w:themeColor="text1"/>
+                  <w:kern w:val="24"/>
+                  <w:szCs w:val="40"/>
+                </w:rPr>
+                <m:t>u</m:t>
+              </m:r>
+              <m:d>
+                <m:dPr>
+                  <m:ctrlPr>
+                    <w:rPr>
+                      <w:rFonts w:ascii="Cambria Math" w:hAnsi="Cambria Math" w:cstheme="minorBidi"/>
+                      <w:i/>
+                      <w:iCs/>
+                      <w:color w:val="000000" w:themeColor="text1"/>
+                      <w:kern w:val="24"/>
+                      <w:szCs w:val="40"/>
+                    </w:rPr>
+                  </m:ctrlPr>
+                </m:dPr>
+                <m:e>
+                  <m:r>
+                    <w:rPr>
+                      <w:rFonts w:ascii="Cambria Math" w:hAnsi="Cambria Math" w:cstheme="minorBidi"/>
+                      <w:color w:val="000000" w:themeColor="text1"/>
+                      <w:kern w:val="24"/>
+                      <w:szCs w:val="40"/>
+                    </w:rPr>
+                    <m:t>t</m:t>
+                  </m:r>
+                </m:e>
+              </m:d>
+              <m:r>
+                <w:rPr>
+                  <w:rFonts w:ascii="Cambria Math" w:hAnsi="Cambria Math" w:cstheme="minorBidi"/>
+                  <w:color w:val="000000" w:themeColor="text1"/>
+                  <w:kern w:val="24"/>
+                  <w:szCs w:val="40"/>
+                </w:rPr>
+                <m:t>dτ</m:t>
+              </m:r>
+            </m:e>
+          </m:nary>
+        </m:oMath>
+      </m:oMathPara>
+    </w:p>
+    <w:p>
+      <w:pPr>
+        <w:jc w:val="both"/>
+        <w:rPr>
+          <w:rFonts w:cstheme="minorHAnsi"/>
+        </w:rPr>
+      </w:pPr>
+    </w:p>
+    <w:p>
+      <w:pPr>
+        <w:jc w:val="both"/>
+        <w:rPr>
+          <w:rFonts w:eastAsiaTheme="minorEastAsia" w:cstheme="minorHAnsi"/>
+        </w:rPr>
+      </w:pPr>
+      <m:oMathPara>
+        <m:oMath>
+          <m:d>
+            <m:dPr>
+              <m:ctrlPr>
+                <w:rPr>
+                  <w:rFonts w:ascii="Cambria Math" w:hAnsi="Cambria Math" w:cstheme="minorHAnsi"/>
+                  <w:i/>
+                </w:rPr>
+              </m:ctrlPr>
+            </m:dPr>
+            <m:e>
+              <m:m>
+                <m:mPr>
+                  <m:mcs>
+                    <m:mc>
+                      <m:mcPr>
+                        <m:count m:val="1"/>
+                        <m:mcJc m:val="center"/>
+                      </m:mcPr>
+                    </m:mc>
+                  </m:mcs>
+                  <m:ctrlPr>
+                    <w:rPr>
+                      <w:rFonts w:ascii="Cambria Math" w:hAnsi="Cambria Math" w:cstheme="minorHAnsi"/>
+                      <w:i/>
+                    </w:rPr>
+                  </m:ctrlPr>
+                </m:mPr>
+                <m:mr>
+                  <m:e>
+                    <m:r>
+                      <w:rPr>
+                        <w:rFonts w:ascii="Cambria Math" w:hAnsi="Cambria Math" w:cstheme="minorHAnsi"/>
+                      </w:rPr>
+                      <m:t>x</m:t>
+                    </m:r>
+                  </m:e>
+                </m:mr>
+                <m:mr>
+                  <m:e>
+                    <m:acc>
+                      <m:accPr>
+                        <m:chr m:val="̇"/>
+                        <m:ctrlPr>
+                          <w:rPr>
+                            <w:rFonts w:ascii="Cambria Math" w:hAnsi="Cambria Math" w:cstheme="minorHAnsi"/>
+                            <w:i/>
+                          </w:rPr>
+                        </m:ctrlPr>
+                      </m:accPr>
+                      <m:e>
+                        <m:r>
+                          <w:rPr>
+                            <w:rFonts w:ascii="Cambria Math" w:hAnsi="Cambria Math" w:cstheme="minorHAnsi"/>
+                          </w:rPr>
+                          <m:t>x</m:t>
+                        </m:r>
+                      </m:e>
+                    </m:acc>
+                  </m:e>
+                </m:mr>
+              </m:m>
+            </m:e>
+          </m:d>
+          <m:r>
+            <w:rPr>
+              <w:rFonts w:ascii="Cambria Math" w:eastAsiaTheme="minorEastAsia" w:hAnsi="Cambria Math" w:cstheme="minorHAnsi"/>
+            </w:rPr>
+            <m:t>=</m:t>
+          </m:r>
+          <m:d>
+            <m:dPr>
+              <m:ctrlPr>
+                <w:rPr>
+                  <w:rFonts w:ascii="Cambria Math" w:eastAsiaTheme="minorEastAsia" w:hAnsi="Cambria Math" w:cstheme="minorHAnsi"/>
+                  <w:i/>
+                </w:rPr>
+              </m:ctrlPr>
+            </m:dPr>
+            <m:e>
+              <m:m>
+                <m:mPr>
+                  <m:mcs>
+                    <m:mc>
+                      <m:mcPr>
+                        <m:count m:val="2"/>
+                        <m:mcJc m:val="center"/>
+                      </m:mcPr>
+                    </m:mc>
+                  </m:mcs>
+                  <m:ctrlPr>
+                    <w:rPr>
+                      <w:rFonts w:ascii="Cambria Math" w:eastAsiaTheme="minorEastAsia" w:hAnsi="Cambria Math" w:cstheme="minorHAnsi"/>
+                      <w:i/>
+                    </w:rPr>
+                  </m:ctrlPr>
+                </m:mPr>
+                <m:mr>
+                  <m:e>
+                    <m:r>
+                      <w:rPr>
+                        <w:rFonts w:ascii="Cambria Math" w:eastAsiaTheme="minorEastAsia" w:hAnsi="Cambria Math" w:cstheme="minorHAnsi"/>
+                      </w:rPr>
+                      <m:t>0</m:t>
+                    </m:r>
+                  </m:e>
+                  <m:e>
+                    <m:r>
+                      <w:rPr>
+                        <w:rFonts w:ascii="Cambria Math" w:eastAsiaTheme="minorEastAsia" w:hAnsi="Cambria Math" w:cstheme="minorHAnsi"/>
+                      </w:rPr>
+                      <m:t>1</m:t>
+                    </m:r>
+                  </m:e>
+                </m:mr>
+                <m:mr>
+                  <m:e>
+                    <m:r>
+                      <w:rPr>
+                        <w:rFonts w:ascii="Cambria Math" w:eastAsiaTheme="minorEastAsia" w:hAnsi="Cambria Math" w:cstheme="minorHAnsi"/>
+                      </w:rPr>
+                      <m:t>0</m:t>
+                    </m:r>
+                  </m:e>
+                  <m:e>
+                    <m:r>
+                      <w:rPr>
+                        <w:rFonts w:ascii="Cambria Math" w:eastAsiaTheme="minorEastAsia" w:hAnsi="Cambria Math" w:cstheme="minorHAnsi"/>
+                      </w:rPr>
+                      <m:t>0</m:t>
+                    </m:r>
+                  </m:e>
+                </m:mr>
+              </m:m>
+            </m:e>
+          </m:d>
+          <m:d>
+            <m:dPr>
+              <m:ctrlPr>
+                <w:rPr>
+                  <w:rFonts w:ascii="Cambria Math" w:hAnsi="Cambria Math" w:cstheme="minorHAnsi"/>
+                  <w:i/>
+                </w:rPr>
+              </m:ctrlPr>
+            </m:dPr>
+            <m:e>
+              <m:m>
+                <m:mPr>
+                  <m:mcs>
+                    <m:mc>
+                      <m:mcPr>
+                        <m:count m:val="1"/>
+                        <m:mcJc m:val="center"/>
+                      </m:mcPr>
+                    </m:mc>
+                  </m:mcs>
+                  <m:ctrlPr>
+                    <w:rPr>
+                      <w:rFonts w:ascii="Cambria Math" w:hAnsi="Cambria Math" w:cstheme="minorHAnsi"/>
+                      <w:i/>
+                    </w:rPr>
+                  </m:ctrlPr>
+                </m:mPr>
+                <m:mr>
+                  <m:e>
+                    <m:r>
+                      <w:rPr>
+                        <w:rFonts w:ascii="Cambria Math" w:hAnsi="Cambria Math" w:cstheme="minorHAnsi"/>
+                      </w:rPr>
+                      <m:t>x</m:t>
+                    </m:r>
+                  </m:e>
+                </m:mr>
+                <m:mr>
+                  <m:e>
+                    <m:acc>
+                      <m:accPr>
+                        <m:chr m:val="̇"/>
+                        <m:ctrlPr>
+                          <w:rPr>
+                            <w:rFonts w:ascii="Cambria Math" w:hAnsi="Cambria Math" w:cstheme="minorHAnsi"/>
+                            <w:i/>
+                          </w:rPr>
+                        </m:ctrlPr>
+                      </m:accPr>
+                      <m:e>
+                        <m:r>
+                          <w:rPr>
+                            <w:rFonts w:ascii="Cambria Math" w:hAnsi="Cambria Math" w:cstheme="minorHAnsi"/>
+                          </w:rPr>
+                          <m:t>x</m:t>
+                        </m:r>
+                      </m:e>
+                    </m:acc>
+                  </m:e>
+                </m:mr>
+              </m:m>
+            </m:e>
+          </m:d>
+          <m:r>
+            <w:rPr>
+              <w:rFonts w:ascii="Cambria Math" w:hAnsi="Cambria Math" w:cstheme="minorHAnsi"/>
+            </w:rPr>
+            <m:t>+</m:t>
+          </m:r>
+          <m:d>
+            <m:dPr>
+              <m:ctrlPr>
+                <w:rPr>
+                  <w:rFonts w:ascii="Cambria Math" w:hAnsi="Cambria Math" w:cstheme="minorHAnsi"/>
+                  <w:i/>
+                </w:rPr>
+              </m:ctrlPr>
+            </m:dPr>
+            <m:e>
+              <m:m>
+                <m:mPr>
+                  <m:mcs>
+                    <m:mc>
+                      <m:mcPr>
+                        <m:count m:val="1"/>
+                        <m:mcJc m:val="center"/>
+                      </m:mcPr>
+                    </m:mc>
+                  </m:mcs>
+                  <m:ctrlPr>
+                    <w:rPr>
+                      <w:rFonts w:ascii="Cambria Math" w:hAnsi="Cambria Math" w:cstheme="minorHAnsi"/>
+                      <w:i/>
+                    </w:rPr>
+                  </m:ctrlPr>
+                </m:mPr>
+                <m:mr>
+                  <m:e>
+                    <m:r>
+                      <w:rPr>
+                        <w:rFonts w:ascii="Cambria Math" w:hAnsi="Cambria Math" w:cstheme="minorHAnsi"/>
+                      </w:rPr>
+                      <m:t>0</m:t>
+                    </m:r>
+                  </m:e>
+                </m:mr>
+                <m:mr>
+                  <m:e>
+                    <m:f>
+                      <m:fPr>
+                        <m:ctrlPr>
+                          <w:rPr>
+                            <w:rFonts w:ascii="Cambria Math" w:hAnsi="Cambria Math" w:cstheme="minorHAnsi"/>
+                            <w:i/>
+                          </w:rPr>
+                        </m:ctrlPr>
+                      </m:fPr>
+                      <m:num>
+                        <m:r>
+                          <w:rPr>
+                            <w:rFonts w:ascii="Cambria Math" w:hAnsi="Cambria Math" w:cstheme="minorHAnsi"/>
+                          </w:rPr>
+                          <m:t>F</m:t>
+                        </m:r>
+                      </m:num>
+                      <m:den>
+                        <m:r>
+                          <w:rPr>
+                            <w:rFonts w:ascii="Cambria Math" w:hAnsi="Cambria Math" w:cstheme="minorHAnsi"/>
+                          </w:rPr>
+                          <m:t>m</m:t>
+                        </m:r>
+                      </m:den>
+                    </m:f>
+                  </m:e>
+                </m:mr>
+              </m:m>
+            </m:e>
+          </m:d>
+          <m:r>
+            <w:rPr>
+              <w:rFonts w:ascii="Cambria Math" w:eastAsiaTheme="minorEastAsia" w:hAnsi="Cambria Math" w:cstheme="minorHAnsi"/>
+            </w:rPr>
+            <m:t>=A</m:t>
+          </m:r>
+          <m:d>
+            <m:dPr>
+              <m:ctrlPr>
+                <w:rPr>
+                  <w:rFonts w:ascii="Cambria Math" w:hAnsi="Cambria Math" w:cstheme="minorHAnsi"/>
+                  <w:i/>
+                </w:rPr>
+              </m:ctrlPr>
+            </m:dPr>
+            <m:e>
+              <m:m>
+                <m:mPr>
+                  <m:mcs>
+                    <m:mc>
+                      <m:mcPr>
+                        <m:count m:val="1"/>
+                        <m:mcJc m:val="center"/>
+                      </m:mcPr>
+                    </m:mc>
+                  </m:mcs>
+                  <m:ctrlPr>
+                    <w:rPr>
+                      <w:rFonts w:ascii="Cambria Math" w:hAnsi="Cambria Math" w:cstheme="minorHAnsi"/>
+                      <w:i/>
+                    </w:rPr>
+                  </m:ctrlPr>
+                </m:mPr>
+                <m:mr>
+                  <m:e>
+                    <m:r>
+                      <w:rPr>
+                        <w:rFonts w:ascii="Cambria Math" w:hAnsi="Cambria Math" w:cstheme="minorHAnsi"/>
+                      </w:rPr>
+                      <m:t>x</m:t>
+                    </m:r>
+                  </m:e>
+                </m:mr>
+                <m:mr>
+                  <m:e>
+                    <m:acc>
+                      <m:accPr>
+                        <m:chr m:val="̇"/>
+                        <m:ctrlPr>
+                          <w:rPr>
+                            <w:rFonts w:ascii="Cambria Math" w:hAnsi="Cambria Math" w:cstheme="minorHAnsi"/>
+                            <w:i/>
+                          </w:rPr>
+                        </m:ctrlPr>
+                      </m:accPr>
+                      <m:e>
+                        <m:r>
+                          <w:rPr>
+                            <w:rFonts w:ascii="Cambria Math" w:hAnsi="Cambria Math" w:cstheme="minorHAnsi"/>
+                          </w:rPr>
+                          <m:t>x</m:t>
+                        </m:r>
+                      </m:e>
+                    </m:acc>
+                  </m:e>
+                </m:mr>
+              </m:m>
+            </m:e>
+          </m:d>
+          <m:r>
+            <w:rPr>
+              <w:rFonts w:ascii="Cambria Math" w:hAnsi="Cambria Math" w:cstheme="minorHAnsi"/>
+            </w:rPr>
+            <m:t>+B</m:t>
+          </m:r>
+          <m:f>
+            <m:fPr>
+              <m:ctrlPr>
+                <w:rPr>
+                  <w:rFonts w:ascii="Cambria Math" w:hAnsi="Cambria Math" w:cstheme="minorHAnsi"/>
+                  <w:i/>
+                </w:rPr>
+              </m:ctrlPr>
+            </m:fPr>
+            <m:num>
+              <m:r>
+                <w:rPr>
+                  <w:rFonts w:ascii="Cambria Math" w:hAnsi="Cambria Math" w:cstheme="minorHAnsi"/>
+                </w:rPr>
+                <m:t>F</m:t>
+              </m:r>
+            </m:num>
+            <m:den>
+              <m:r>
+                <w:rPr>
+                  <w:rFonts w:ascii="Cambria Math" w:hAnsi="Cambria Math" w:cstheme="minorHAnsi"/>
+                </w:rPr>
+                <m:t>m</m:t>
+              </m:r>
+            </m:den>
+          </m:f>
+        </m:oMath>
+      </m:oMathPara>
+    </w:p>
+    <w:p>
+      <w:pPr>
+        <w:jc w:val="center"/>
+        <w:rPr>
+          <w:rFonts w:cstheme="minorHAnsi"/>
+        </w:rPr>
+      </w:pPr>
+      <m:oMath>
+        <m:r>
+          <w:rPr>
+            <w:rFonts w:ascii="Cambria Math" w:eastAsiaTheme="minorEastAsia" w:hAnsi="Cambria Math" w:cstheme="minorHAnsi"/>
+          </w:rPr>
+          <m:t>A</m:t>
+        </m:r>
+        <m:r>
+          <w:rPr>
+            <w:rFonts w:ascii="Cambria Math" w:eastAsiaTheme="minorEastAsia" w:hAnsi="Cambria Math" w:cstheme="minorHAnsi"/>
+          </w:rPr>
+          <m:t>=</m:t>
+        </m:r>
+        <m:d>
+          <m:dPr>
+            <m:ctrlPr>
+              <w:rPr>
+                <w:rFonts w:ascii="Cambria Math" w:eastAsiaTheme="minorEastAsia" w:hAnsi="Cambria Math" w:cstheme="minorHAnsi"/>
+                <w:i/>
+              </w:rPr>
+            </m:ctrlPr>
+          </m:dPr>
+          <m:e>
+            <m:m>
+              <m:mPr>
+                <m:mcs>
+                  <m:mc>
+                    <m:mcPr>
+                      <m:count m:val="2"/>
+                      <m:mcJc m:val="center"/>
+                    </m:mcPr>
+                  </m:mc>
+                </m:mcs>
+                <m:ctrlPr>
+                  <w:rPr>
+                    <w:rFonts w:ascii="Cambria Math" w:eastAsiaTheme="minorEastAsia" w:hAnsi="Cambria Math" w:cstheme="minorHAnsi"/>
+                    <w:i/>
+                  </w:rPr>
+                </m:ctrlPr>
+              </m:mPr>
+              <m:mr>
+                <m:e>
+                  <m:r>
+                    <w:rPr>
+                      <w:rFonts w:ascii="Cambria Math" w:eastAsiaTheme="minorEastAsia" w:hAnsi="Cambria Math" w:cstheme="minorHAnsi"/>
+                    </w:rPr>
+                    <m:t>0</m:t>
+                  </m:r>
+                </m:e>
+                <m:e>
+                  <m:r>
+                    <w:rPr>
+                      <w:rFonts w:ascii="Cambria Math" w:eastAsiaTheme="minorEastAsia" w:hAnsi="Cambria Math" w:cstheme="minorHAnsi"/>
+                    </w:rPr>
+                    <m:t>1</m:t>
+                  </m:r>
+                </m:e>
+              </m:mr>
+              <m:mr>
+                <m:e>
+                  <m:r>
+                    <w:rPr>
+                      <w:rFonts w:ascii="Cambria Math" w:eastAsiaTheme="minorEastAsia" w:hAnsi="Cambria Math" w:cstheme="minorHAnsi"/>
+                    </w:rPr>
+                    <m:t>0</m:t>
+                  </m:r>
+                </m:e>
+                <m:e>
+                  <m:r>
+                    <w:rPr>
+                      <w:rFonts w:ascii="Cambria Math" w:eastAsiaTheme="minorEastAsia" w:hAnsi="Cambria Math" w:cstheme="minorHAnsi"/>
+                    </w:rPr>
+                    <m:t>0</m:t>
+                  </m:r>
+                </m:e>
+              </m:mr>
+            </m:m>
+          </m:e>
+        </m:d>
+      </m:oMath>
+      <w:r>
+        <w:rPr>
+          <w:rFonts w:eastAsiaTheme="minorEastAsia" w:cstheme="minorHAnsi"/>
+        </w:rPr>
+        <w:t xml:space="preserve">        </w:t>
+      </w:r>
+      <m:oMath>
+        <m:r>
+          <w:rPr>
+            <w:rFonts w:ascii="Cambria Math" w:hAnsi="Cambria Math" w:cstheme="minorHAnsi"/>
+          </w:rPr>
+          <m:t>B</m:t>
+        </m:r>
+        <m:r>
+          <w:rPr>
+            <w:rFonts w:ascii="Cambria Math" w:hAnsi="Cambria Math" w:cstheme="minorHAnsi"/>
+          </w:rPr>
+          <m:t>=</m:t>
+        </m:r>
+        <m:d>
+          <m:dPr>
+            <m:ctrlPr>
+              <w:rPr>
+                <w:rFonts w:ascii="Cambria Math" w:hAnsi="Cambria Math" w:cstheme="minorHAnsi"/>
+                <w:i/>
+              </w:rPr>
+            </m:ctrlPr>
+          </m:dPr>
+          <m:e>
+            <m:m>
+              <m:mPr>
+                <m:mcs>
+                  <m:mc>
+                    <m:mcPr>
+                      <m:count m:val="1"/>
+                      <m:mcJc m:val="center"/>
+                    </m:mcPr>
+                  </m:mc>
+                </m:mcs>
+                <m:ctrlPr>
+                  <w:rPr>
+                    <w:rFonts w:ascii="Cambria Math" w:hAnsi="Cambria Math" w:cstheme="minorHAnsi"/>
+                    <w:i/>
+                  </w:rPr>
+                </m:ctrlPr>
+              </m:mPr>
+              <m:mr>
+                <m:e>
+                  <m:r>
+                    <w:rPr>
+                      <w:rFonts w:ascii="Cambria Math" w:hAnsi="Cambria Math" w:cstheme="minorHAnsi"/>
+                    </w:rPr>
+                    <m:t>0</m:t>
+                  </m:r>
+                </m:e>
+              </m:mr>
+              <m:mr>
+                <m:e>
+                  <m:r>
+                    <w:rPr>
+                      <w:rFonts w:ascii="Cambria Math" w:hAnsi="Cambria Math" w:cstheme="minorHAnsi"/>
+                    </w:rPr>
+                    <m:t>1</m:t>
+                  </m:r>
+                </m:e>
+              </m:mr>
+            </m:m>
+          </m:e>
+        </m:d>
+      </m:oMath>
+      <w:bookmarkStart w:id="0" w:name="_GoBack"/>
+      <w:bookmarkEnd w:id="0"/>
+    </w:p>
+    <w:p>
+      <w:pPr>
+        <w:jc w:val="both"/>
+        <w:rPr>
+          <w:rFonts w:cstheme="minorHAnsi"/>
+        </w:rPr>
+      </w:pPr>
+    </w:p>
+    <w:p>
+      <w:pPr>
+        <w:jc w:val="both"/>
+        <w:rPr>
+          <w:rFonts w:eastAsiaTheme="minorEastAsia" w:cstheme="minorHAnsi"/>
+        </w:rPr>
+      </w:pPr>
+      <w:r>
+        <w:rPr>
+          <w:rFonts w:cstheme="minorHAnsi"/>
+        </w:rPr>
+        <w:t>3</w:t>
+      </w:r>
+      <w:r>
+        <w:rPr>
+          <w:rFonts w:cstheme="minorHAnsi"/>
+        </w:rPr>
+        <w:t>b</w:t>
+      </w:r>
+      <w:r>
+        <w:rPr>
+          <w:rFonts w:cstheme="minorHAnsi"/>
+        </w:rPr>
+        <w:t>. Przetestuj działanie metody na oscylatorze harmonicznym z zadania 2</w:t>
+      </w:r>
+      <w:r>
+        <w:rPr>
+          <w:rFonts w:cstheme="minorHAnsi"/>
+        </w:rPr>
+        <w:t xml:space="preserve">, zadając siłę zewnętrzną postaci </w:t>
+      </w:r>
+      <m:oMath>
+        <m:r>
+          <w:rPr>
+            <w:rFonts w:ascii="Cambria Math" w:hAnsi="Cambria Math" w:cstheme="minorHAnsi"/>
+          </w:rPr>
+          <m:t>F</m:t>
+        </m:r>
+        <m:d>
+          <m:dPr>
+            <m:ctrlPr>
+              <w:rPr>
+                <w:rFonts w:ascii="Cambria Math" w:hAnsi="Cambria Math" w:cstheme="minorHAnsi"/>
+                <w:i/>
+              </w:rPr>
+            </m:ctrlPr>
+          </m:dPr>
+          <m:e>
+            <m:r>
+              <w:rPr>
+                <w:rFonts w:ascii="Cambria Math" w:hAnsi="Cambria Math" w:cstheme="minorHAnsi"/>
+              </w:rPr>
+              <m:t>t</m:t>
+            </m:r>
+          </m:e>
+        </m:d>
+        <m:r>
+          <w:rPr>
+            <w:rFonts w:ascii="Cambria Math" w:hAnsi="Cambria Math" w:cstheme="minorHAnsi"/>
+          </w:rPr>
+          <m:t>=</m:t>
+        </m:r>
+        <m:sSub>
+          <m:sSubPr>
+            <m:ctrlPr>
+              <w:rPr>
+                <w:rFonts w:ascii="Cambria Math" w:hAnsi="Cambria Math" w:cstheme="minorHAnsi"/>
+                <w:i/>
+              </w:rPr>
+            </m:ctrlPr>
+          </m:sSubPr>
+          <m:e>
+            <m:r>
+              <w:rPr>
+                <w:rFonts w:ascii="Cambria Math" w:hAnsi="Cambria Math" w:cstheme="minorHAnsi"/>
+              </w:rPr>
+              <m:t>F</m:t>
+            </m:r>
+          </m:e>
+          <m:sub>
+            <m:r>
+              <w:rPr>
+                <w:rFonts w:ascii="Cambria Math" w:hAnsi="Cambria Math" w:cstheme="minorHAnsi"/>
+              </w:rPr>
+              <m:t>0</m:t>
+            </m:r>
+          </m:sub>
+        </m:sSub>
+        <m:r>
+          <m:rPr>
+            <m:sty m:val="p"/>
+          </m:rPr>
+          <w:rPr>
+            <w:rFonts w:ascii="Cambria Math" w:hAnsi="Cambria Math" w:cstheme="minorHAnsi"/>
+          </w:rPr>
+          <m:t>sin⁡</m:t>
+        </m:r>
+        <m:r>
+          <w:rPr>
+            <w:rFonts w:ascii="Cambria Math" w:hAnsi="Cambria Math" w:cstheme="minorHAnsi"/>
+          </w:rPr>
+          <m:t>(ωt)</m:t>
+        </m:r>
+      </m:oMath>
+    </w:p>
+    <w:p>
+      <w:pPr>
+        <w:jc w:val="both"/>
+        <w:rPr>
+          <w:rFonts w:cstheme="minorHAnsi"/>
+        </w:rPr>
+      </w:pPr>
+    </w:p>
+    <w:p>
+      <w:pPr>
         <w:pStyle w:val="Akapitzlist"/>
         <w:numPr>
           <w:ilvl w:val="0"/>
@@ -1742,7 +2806,6 @@
         <w:rPr>
           <w:rFonts w:cstheme="minorHAnsi"/>
         </w:rPr>
-        <w:lastRenderedPageBreak/>
         <w:t>Wykorzystując napisaną metodę wyznacz charakterystykę częstotliwościową filtra pasmowego RLC</w:t>
       </w:r>
     </w:p>
@@ -1880,6 +2943,7 @@
         <w:rPr>
           <w:noProof/>
         </w:rPr>
+        <w:lastRenderedPageBreak/>
         <w:drawing>
           <wp:inline distT="0" distB="0" distL="0" distR="0" wp14:anchorId="599EA352" wp14:editId="46A5AC70">
             <wp:extent cx="2991109" cy="552498"/>

</xml_diff>